<commit_message>
Divide el Conversacional de Abby en A2.1 y A2.2
Dos peldanos de 8 sesiones · 1/semana cada uno: A2.1 "Corea que amas"
(orientacion + modulos 1-5 + 2 labs) y A2.2 "Corea por dentro"
(modulos 6-10 + 2 labs + evaluacion final). Toda la escalera queda en
el contenedor uniforme de 8 semanas; precio unico US$150 por peldano
(early-bird US$119, US$79x2 mensual) y bundle de dos peldanos US$269.
En octubre abre A2.1; A2.2 se suma desde enero.

Co-Authored-By: Claude Fable 5 <noreply@anthropic.com>
</commit_message>
<xml_diff>
--- a/Desarrollo_Clases_2026-2.docx
+++ b/Desarrollo_Clases_2026-2.docx
@@ -50,7 +50,7 @@
           <w:sz w:val="24"/>
           <w:szCs w:val="24"/>
         </w:rPr>
-        <w:t xml:space="preserve">Básico 1.1 y Básico 2 (A2), clase a clase · Formato 8 semanas · Evaluación de precios</w:t>
+        <w:t xml:space="preserve">Básico 1.1 · Básico 2 · Conversacional A2.1 y A2.2, clase a clase · Todo a 8 semanas · Evaluación de precios</w:t>
       </w:r>
     </w:p>
     <w:p>
@@ -2999,6 +2999,7 @@
     <w:p>
       <w:pPr>
         <w:keepNext/>
+        <w:pageBreakBefore/>
         <w:pBdr>
           <w:bottom w:val="single" w:color="CCCCCC" w:sz="6" w:space="4"/>
         </w:pBdr>
@@ -3013,7 +3014,7 @@
           <w:sz w:val="26"/>
           <w:szCs w:val="26"/>
         </w:rPr>
-        <w:t xml:space="preserve">4. Conversacional (Abby) · estado</w:t>
+        <w:t xml:space="preserve">4. Conversacional (Abby) · dividido en A2.1 y A2.2</w:t>
       </w:r>
     </w:p>
     <w:p>
@@ -3029,7 +3030,7 @@
           <w:sz w:val="21"/>
           <w:szCs w:val="21"/>
         </w:rPr>
-        <w:t xml:space="preserve">Ya desarrollado y producido: </w:t>
+        <w:t xml:space="preserve">Decisión: </w:t>
       </w:r>
       <w:r>
         <w:rPr>
@@ -3038,7 +3039,1590 @@
           <w:sz w:val="21"/>
           <w:szCs w:val="21"/>
         </w:rPr>
-        <w:t xml:space="preserve">10 decks trilingües auditados contra Korean Grammar in Use + 4 labs de conversación + evaluación oral final (estructura completa en el Plan de Cursos 2026-2 §2.2). No requiere trabajo nuevo para octubre — solo confirmar horario con Abby. Es el curso que definió el estándar Chingu Modular que 1.1 y A2 ahora adoptan.</w:t>
+        <w:t xml:space="preserve">el curso de 16 sesiones se divide en dos peldaños de 8 sesiones · 1 por semana. Ventajas: TODA la escalera queda en el mismo contenedor (8 semanas, 1 clase/semana), la carga de Abby baja a la mitad por cohorte, el ticket de entrada al mundo Abby es más accesible, y ganamos un peldaño más de retención y certificación. Los 10 decks ya producidos se reparten sin producir nada nuevo.</w:t>
+      </w:r>
+    </w:p>
+    <w:p>
+      <w:pPr>
+        <w:keepNext/>
+        <w:spacing w:after="100" w:before="240"/>
+      </w:pPr>
+      <w:r>
+        <w:rPr>
+          <w:rFonts w:ascii="Arial" w:cs="Arial" w:eastAsia="Arial" w:hAnsi="Arial"/>
+          <w:b/>
+          <w:bCs/>
+          <w:color w:val="C8001E"/>
+          <w:sz w:val="22"/>
+          <w:szCs w:val="22"/>
+        </w:rPr>
+        <w:t xml:space="preserve">4.1 Conversacional A2.1 · “Corea que amas” (con Abby)</w:t>
+      </w:r>
+    </w:p>
+    <w:tbl>
+      <w:tblPr>
+        <w:tblW w:type="dxa" w:w="9360"/>
+        <w:tblBorders>
+          <w:top w:val="single" w:color="CCCCCC" w:sz="4"/>
+          <w:left w:val="single" w:color="CCCCCC" w:sz="4"/>
+          <w:bottom w:val="single" w:color="CCCCCC" w:sz="4"/>
+          <w:right w:val="single" w:color="CCCCCC" w:sz="4"/>
+          <w:insideH w:val="single" w:color="CCCCCC" w:sz="4"/>
+          <w:insideV w:val="single" w:color="CCCCCC" w:sz="4"/>
+        </w:tblBorders>
+      </w:tblPr>
+      <w:tblGrid>
+        <w:gridCol w:w="560"/>
+        <w:gridCol w:w="4800"/>
+        <w:gridCol w:w="4000"/>
+      </w:tblGrid>
+      <w:tr>
+        <w:trPr>
+          <w:tblHeader/>
+        </w:trPr>
+        <w:tc>
+          <w:tcPr>
+            <w:tcW w:type="dxa" w:w="560"/>
+            <w:shd w:fill="003478" w:val="clear"/>
+            <w:tcMar>
+              <w:top w:type="dxa" w:w="70"/>
+              <w:left w:type="dxa" w:w="110"/>
+              <w:bottom w:type="dxa" w:w="70"/>
+              <w:right w:type="dxa" w:w="110"/>
+            </w:tcMar>
+            <w:vAlign w:val="center"/>
+          </w:tcPr>
+          <w:p>
+            <w:pPr>
+              <w:spacing w:after="0" w:line="264"/>
+            </w:pPr>
+            <w:r>
+              <w:rPr>
+                <w:rFonts w:ascii="Arial" w:cs="Arial" w:eastAsia="Arial" w:hAnsi="Arial"/>
+                <w:b/>
+                <w:bCs/>
+                <w:color w:val="FFFFFF"/>
+                <w:sz w:val="20"/>
+                <w:szCs w:val="20"/>
+              </w:rPr>
+              <w:t xml:space="preserve">Clase</w:t>
+            </w:r>
+          </w:p>
+        </w:tc>
+        <w:tc>
+          <w:tcPr>
+            <w:tcW w:type="dxa" w:w="4800"/>
+            <w:shd w:fill="003478" w:val="clear"/>
+            <w:tcMar>
+              <w:top w:type="dxa" w:w="70"/>
+              <w:left w:type="dxa" w:w="110"/>
+              <w:bottom w:type="dxa" w:w="70"/>
+              <w:right w:type="dxa" w:w="110"/>
+            </w:tcMar>
+            <w:vAlign w:val="center"/>
+          </w:tcPr>
+          <w:p>
+            <w:pPr>
+              <w:spacing w:after="0" w:line="264"/>
+            </w:pPr>
+            <w:r>
+              <w:rPr>
+                <w:rFonts w:ascii="Arial" w:cs="Arial" w:eastAsia="Arial" w:hAnsi="Arial"/>
+                <w:b/>
+                <w:bCs/>
+                <w:color w:val="FFFFFF"/>
+                <w:sz w:val="20"/>
+                <w:szCs w:val="20"/>
+              </w:rPr>
+              <w:t xml:space="preserve">Contenido (decks ya producidos)</w:t>
+            </w:r>
+          </w:p>
+        </w:tc>
+        <w:tc>
+          <w:tcPr>
+            <w:tcW w:type="dxa" w:w="4000"/>
+            <w:shd w:fill="003478" w:val="clear"/>
+            <w:tcMar>
+              <w:top w:type="dxa" w:w="70"/>
+              <w:left w:type="dxa" w:w="110"/>
+              <w:bottom w:type="dxa" w:w="70"/>
+              <w:right w:type="dxa" w:w="110"/>
+            </w:tcMar>
+            <w:vAlign w:val="center"/>
+          </w:tcPr>
+          <w:p>
+            <w:pPr>
+              <w:spacing w:after="0" w:line="264"/>
+            </w:pPr>
+            <w:r>
+              <w:rPr>
+                <w:rFonts w:ascii="Arial" w:cs="Arial" w:eastAsia="Arial" w:hAnsi="Arial"/>
+                <w:b/>
+                <w:bCs/>
+                <w:color w:val="FFFFFF"/>
+                <w:sz w:val="20"/>
+                <w:szCs w:val="20"/>
+              </w:rPr>
+              <w:t xml:space="preserve">Foco</w:t>
+            </w:r>
+          </w:p>
+        </w:tc>
+      </w:tr>
+      <w:tr>
+        <w:tc>
+          <w:tcPr>
+            <w:tcW w:type="dxa" w:w="560"/>
+            <w:tcMar>
+              <w:top w:type="dxa" w:w="70"/>
+              <w:left w:type="dxa" w:w="110"/>
+              <w:bottom w:type="dxa" w:w="70"/>
+              <w:right w:type="dxa" w:w="110"/>
+            </w:tcMar>
+            <w:vAlign w:val="center"/>
+          </w:tcPr>
+          <w:p>
+            <w:pPr>
+              <w:spacing w:after="0" w:line="264"/>
+            </w:pPr>
+            <w:r>
+              <w:rPr>
+                <w:rFonts w:ascii="Arial" w:cs="Arial" w:eastAsia="Arial" w:hAnsi="Arial"/>
+                <w:color w:val="1B1C24"/>
+                <w:sz w:val="20"/>
+                <w:szCs w:val="20"/>
+              </w:rPr>
+              <w:t xml:space="preserve">1</w:t>
+            </w:r>
+          </w:p>
+        </w:tc>
+        <w:tc>
+          <w:tcPr>
+            <w:tcW w:type="dxa" w:w="4800"/>
+            <w:tcMar>
+              <w:top w:type="dxa" w:w="70"/>
+              <w:left w:type="dxa" w:w="110"/>
+              <w:bottom w:type="dxa" w:w="70"/>
+              <w:right w:type="dxa" w:w="110"/>
+            </w:tcMar>
+            <w:vAlign w:val="center"/>
+          </w:tcPr>
+          <w:p>
+            <w:pPr>
+              <w:spacing w:after="0" w:line="264"/>
+            </w:pPr>
+            <w:r>
+              <w:rPr>
+                <w:rFonts w:ascii="Arial" w:cs="Arial" w:eastAsia="Arial" w:hAnsi="Arial"/>
+                <w:color w:val="1B1C24"/>
+                <w:sz w:val="20"/>
+                <w:szCs w:val="20"/>
+              </w:rPr>
+              <w:t xml:space="preserve">Orientación + diagnóstico oral individual</w:t>
+            </w:r>
+          </w:p>
+        </w:tc>
+        <w:tc>
+          <w:tcPr>
+            <w:tcW w:type="dxa" w:w="4000"/>
+            <w:tcMar>
+              <w:top w:type="dxa" w:w="70"/>
+              <w:left w:type="dxa" w:w="110"/>
+              <w:bottom w:type="dxa" w:w="70"/>
+              <w:right w:type="dxa" w:w="110"/>
+            </w:tcMar>
+            <w:vAlign w:val="center"/>
+          </w:tcPr>
+          <w:p>
+            <w:pPr>
+              <w:spacing w:after="0" w:line="264"/>
+            </w:pPr>
+            <w:r>
+              <w:rPr>
+                <w:rFonts w:ascii="Arial" w:cs="Arial" w:eastAsia="Arial" w:hAnsi="Arial"/>
+                <w:color w:val="1B1C24"/>
+                <w:sz w:val="20"/>
+                <w:szCs w:val="20"/>
+              </w:rPr>
+              <w:t xml:space="preserve">Romper el hielo · fijar metas personales</w:t>
+            </w:r>
+          </w:p>
+        </w:tc>
+      </w:tr>
+      <w:tr>
+        <w:tc>
+          <w:tcPr>
+            <w:tcW w:type="dxa" w:w="560"/>
+            <w:shd w:fill="F7F8FA" w:val="clear"/>
+            <w:tcMar>
+              <w:top w:type="dxa" w:w="70"/>
+              <w:left w:type="dxa" w:w="110"/>
+              <w:bottom w:type="dxa" w:w="70"/>
+              <w:right w:type="dxa" w:w="110"/>
+            </w:tcMar>
+            <w:vAlign w:val="center"/>
+          </w:tcPr>
+          <w:p>
+            <w:pPr>
+              <w:spacing w:after="0" w:line="264"/>
+            </w:pPr>
+            <w:r>
+              <w:rPr>
+                <w:rFonts w:ascii="Arial" w:cs="Arial" w:eastAsia="Arial" w:hAnsi="Arial"/>
+                <w:color w:val="1B1C24"/>
+                <w:sz w:val="20"/>
+                <w:szCs w:val="20"/>
+              </w:rPr>
+              <w:t xml:space="preserve">2</w:t>
+            </w:r>
+          </w:p>
+        </w:tc>
+        <w:tc>
+          <w:tcPr>
+            <w:tcW w:type="dxa" w:w="4800"/>
+            <w:shd w:fill="F7F8FA" w:val="clear"/>
+            <w:tcMar>
+              <w:top w:type="dxa" w:w="70"/>
+              <w:left w:type="dxa" w:w="110"/>
+              <w:bottom w:type="dxa" w:w="70"/>
+              <w:right w:type="dxa" w:w="110"/>
+            </w:tcMar>
+            <w:vAlign w:val="center"/>
+          </w:tcPr>
+          <w:p>
+            <w:pPr>
+              <w:spacing w:after="0" w:line="264"/>
+            </w:pPr>
+            <w:r>
+              <w:rPr>
+                <w:rFonts w:ascii="Arial" w:cs="Arial" w:eastAsia="Arial" w:hAnsi="Arial"/>
+                <w:color w:val="1B1C24"/>
+                <w:sz w:val="20"/>
+                <w:szCs w:val="20"/>
+              </w:rPr>
+              <w:t xml:space="preserve">M01 · K-Pop y cultura fan</w:t>
+            </w:r>
+          </w:p>
+        </w:tc>
+        <w:tc>
+          <w:tcPr>
+            <w:tcW w:type="dxa" w:w="4000"/>
+            <w:shd w:fill="F7F8FA" w:val="clear"/>
+            <w:tcMar>
+              <w:top w:type="dxa" w:w="70"/>
+              <w:left w:type="dxa" w:w="110"/>
+              <w:bottom w:type="dxa" w:w="70"/>
+              <w:right w:type="dxa" w:w="110"/>
+            </w:tcMar>
+            <w:vAlign w:val="center"/>
+          </w:tcPr>
+          <w:p>
+            <w:pPr>
+              <w:spacing w:after="0" w:line="264"/>
+            </w:pPr>
+            <w:r>
+              <w:rPr>
+                <w:rFonts w:ascii="Arial" w:cs="Arial" w:eastAsia="Arial" w:hAnsi="Arial"/>
+                <w:color w:val="1B1C24"/>
+                <w:sz w:val="20"/>
+                <w:szCs w:val="20"/>
+              </w:rPr>
+              <w:t xml:space="preserve">2–3 estructuras del módulo (KGIU citado)</w:t>
+            </w:r>
+          </w:p>
+        </w:tc>
+      </w:tr>
+      <w:tr>
+        <w:tc>
+          <w:tcPr>
+            <w:tcW w:type="dxa" w:w="560"/>
+            <w:tcMar>
+              <w:top w:type="dxa" w:w="70"/>
+              <w:left w:type="dxa" w:w="110"/>
+              <w:bottom w:type="dxa" w:w="70"/>
+              <w:right w:type="dxa" w:w="110"/>
+            </w:tcMar>
+            <w:vAlign w:val="center"/>
+          </w:tcPr>
+          <w:p>
+            <w:pPr>
+              <w:spacing w:after="0" w:line="264"/>
+            </w:pPr>
+            <w:r>
+              <w:rPr>
+                <w:rFonts w:ascii="Arial" w:cs="Arial" w:eastAsia="Arial" w:hAnsi="Arial"/>
+                <w:color w:val="1B1C24"/>
+                <w:sz w:val="20"/>
+                <w:szCs w:val="20"/>
+              </w:rPr>
+              <w:t xml:space="preserve">3</w:t>
+            </w:r>
+          </w:p>
+        </w:tc>
+        <w:tc>
+          <w:tcPr>
+            <w:tcW w:type="dxa" w:w="4800"/>
+            <w:tcMar>
+              <w:top w:type="dxa" w:w="70"/>
+              <w:left w:type="dxa" w:w="110"/>
+              <w:bottom w:type="dxa" w:w="70"/>
+              <w:right w:type="dxa" w:w="110"/>
+            </w:tcMar>
+            <w:vAlign w:val="center"/>
+          </w:tcPr>
+          <w:p>
+            <w:pPr>
+              <w:spacing w:after="0" w:line="264"/>
+            </w:pPr>
+            <w:r>
+              <w:rPr>
+                <w:rFonts w:ascii="Arial" w:cs="Arial" w:eastAsia="Arial" w:hAnsi="Arial"/>
+                <w:color w:val="1B1C24"/>
+                <w:sz w:val="20"/>
+                <w:szCs w:val="20"/>
+              </w:rPr>
+              <w:t xml:space="preserve">M02 · Viajes: Jeju y Seúl</w:t>
+            </w:r>
+          </w:p>
+        </w:tc>
+        <w:tc>
+          <w:tcPr>
+            <w:tcW w:type="dxa" w:w="4000"/>
+            <w:tcMar>
+              <w:top w:type="dxa" w:w="70"/>
+              <w:left w:type="dxa" w:w="110"/>
+              <w:bottom w:type="dxa" w:w="70"/>
+              <w:right w:type="dxa" w:w="110"/>
+            </w:tcMar>
+            <w:vAlign w:val="center"/>
+          </w:tcPr>
+          <w:p>
+            <w:pPr>
+              <w:spacing w:after="0" w:line="264"/>
+            </w:pPr>
+            <w:r>
+              <w:rPr>
+                <w:rFonts w:ascii="Arial" w:cs="Arial" w:eastAsia="Arial" w:hAnsi="Arial"/>
+                <w:color w:val="1B1C24"/>
+                <w:sz w:val="20"/>
+                <w:szCs w:val="20"/>
+              </w:rPr>
+              <w:t xml:space="preserve">Planear y contar viajes</w:t>
+            </w:r>
+          </w:p>
+        </w:tc>
+      </w:tr>
+      <w:tr>
+        <w:tc>
+          <w:tcPr>
+            <w:tcW w:type="dxa" w:w="560"/>
+            <w:shd w:fill="F7F8FA" w:val="clear"/>
+            <w:tcMar>
+              <w:top w:type="dxa" w:w="70"/>
+              <w:left w:type="dxa" w:w="110"/>
+              <w:bottom w:type="dxa" w:w="70"/>
+              <w:right w:type="dxa" w:w="110"/>
+            </w:tcMar>
+            <w:vAlign w:val="center"/>
+          </w:tcPr>
+          <w:p>
+            <w:pPr>
+              <w:spacing w:after="0" w:line="264"/>
+            </w:pPr>
+            <w:r>
+              <w:rPr>
+                <w:rFonts w:ascii="Arial" w:cs="Arial" w:eastAsia="Arial" w:hAnsi="Arial"/>
+                <w:color w:val="1B1C24"/>
+                <w:sz w:val="20"/>
+                <w:szCs w:val="20"/>
+              </w:rPr>
+              <w:t xml:space="preserve">4</w:t>
+            </w:r>
+          </w:p>
+        </w:tc>
+        <w:tc>
+          <w:tcPr>
+            <w:tcW w:type="dxa" w:w="4800"/>
+            <w:shd w:fill="F7F8FA" w:val="clear"/>
+            <w:tcMar>
+              <w:top w:type="dxa" w:w="70"/>
+              <w:left w:type="dxa" w:w="110"/>
+              <w:bottom w:type="dxa" w:w="70"/>
+              <w:right w:type="dxa" w:w="110"/>
+            </w:tcMar>
+            <w:vAlign w:val="center"/>
+          </w:tcPr>
+          <w:p>
+            <w:pPr>
+              <w:spacing w:after="0" w:line="264"/>
+            </w:pPr>
+            <w:r>
+              <w:rPr>
+                <w:rFonts w:ascii="Arial" w:cs="Arial" w:eastAsia="Arial" w:hAnsi="Arial"/>
+                <w:color w:val="1B1C24"/>
+                <w:sz w:val="20"/>
+                <w:szCs w:val="20"/>
+              </w:rPr>
+              <w:t xml:space="preserve">M03 · Cultura gastronómica (deck de Abby)</w:t>
+            </w:r>
+          </w:p>
+        </w:tc>
+        <w:tc>
+          <w:tcPr>
+            <w:tcW w:type="dxa" w:w="4000"/>
+            <w:shd w:fill="F7F8FA" w:val="clear"/>
+            <w:tcMar>
+              <w:top w:type="dxa" w:w="70"/>
+              <w:left w:type="dxa" w:w="110"/>
+              <w:bottom w:type="dxa" w:w="70"/>
+              <w:right w:type="dxa" w:w="110"/>
+            </w:tcMar>
+            <w:vAlign w:val="center"/>
+          </w:tcPr>
+          <w:p>
+            <w:pPr>
+              <w:spacing w:after="0" w:line="264"/>
+            </w:pPr>
+            <w:r>
+              <w:rPr>
+                <w:rFonts w:ascii="Arial" w:cs="Arial" w:eastAsia="Arial" w:hAnsi="Arial"/>
+                <w:color w:val="1B1C24"/>
+                <w:sz w:val="20"/>
+                <w:szCs w:val="20"/>
+              </w:rPr>
+              <w:t xml:space="preserve">Pedir, recomendar, describir sabores</w:t>
+            </w:r>
+          </w:p>
+        </w:tc>
+      </w:tr>
+      <w:tr>
+        <w:tc>
+          <w:tcPr>
+            <w:tcW w:type="dxa" w:w="560"/>
+            <w:tcMar>
+              <w:top w:type="dxa" w:w="70"/>
+              <w:left w:type="dxa" w:w="110"/>
+              <w:bottom w:type="dxa" w:w="70"/>
+              <w:right w:type="dxa" w:w="110"/>
+            </w:tcMar>
+            <w:vAlign w:val="center"/>
+          </w:tcPr>
+          <w:p>
+            <w:pPr>
+              <w:spacing w:after="0" w:line="264"/>
+            </w:pPr>
+            <w:r>
+              <w:rPr>
+                <w:rFonts w:ascii="Arial" w:cs="Arial" w:eastAsia="Arial" w:hAnsi="Arial"/>
+                <w:color w:val="1B1C24"/>
+                <w:sz w:val="20"/>
+                <w:szCs w:val="20"/>
+              </w:rPr>
+              <w:t xml:space="preserve">5</w:t>
+            </w:r>
+          </w:p>
+        </w:tc>
+        <w:tc>
+          <w:tcPr>
+            <w:tcW w:type="dxa" w:w="4800"/>
+            <w:tcMar>
+              <w:top w:type="dxa" w:w="70"/>
+              <w:left w:type="dxa" w:w="110"/>
+              <w:bottom w:type="dxa" w:w="70"/>
+              <w:right w:type="dxa" w:w="110"/>
+            </w:tcMar>
+            <w:vAlign w:val="center"/>
+          </w:tcPr>
+          <w:p>
+            <w:pPr>
+              <w:spacing w:after="0" w:line="264"/>
+            </w:pPr>
+            <w:r>
+              <w:rPr>
+                <w:rFonts w:ascii="Arial" w:cs="Arial" w:eastAsia="Arial" w:hAnsi="Arial"/>
+                <w:color w:val="1B1C24"/>
+                <w:sz w:val="20"/>
+                <w:szCs w:val="20"/>
+              </w:rPr>
+              <w:t xml:space="preserve">Lab de conversación 1 (módulos 1–3)</w:t>
+            </w:r>
+          </w:p>
+        </w:tc>
+        <w:tc>
+          <w:tcPr>
+            <w:tcW w:type="dxa" w:w="4000"/>
+            <w:tcMar>
+              <w:top w:type="dxa" w:w="70"/>
+              <w:left w:type="dxa" w:w="110"/>
+              <w:bottom w:type="dxa" w:w="70"/>
+              <w:right w:type="dxa" w:w="110"/>
+            </w:tcMar>
+            <w:vAlign w:val="center"/>
+          </w:tcPr>
+          <w:p>
+            <w:pPr>
+              <w:spacing w:after="0" w:line="264"/>
+            </w:pPr>
+            <w:r>
+              <w:rPr>
+                <w:rFonts w:ascii="Arial" w:cs="Arial" w:eastAsia="Arial" w:hAnsi="Arial"/>
+                <w:color w:val="1B1C24"/>
+                <w:sz w:val="20"/>
+                <w:szCs w:val="20"/>
+              </w:rPr>
+              <w:t xml:space="preserve">Práctica oral pura en grupos pequeños</w:t>
+            </w:r>
+          </w:p>
+        </w:tc>
+      </w:tr>
+      <w:tr>
+        <w:tc>
+          <w:tcPr>
+            <w:tcW w:type="dxa" w:w="560"/>
+            <w:shd w:fill="F7F8FA" w:val="clear"/>
+            <w:tcMar>
+              <w:top w:type="dxa" w:w="70"/>
+              <w:left w:type="dxa" w:w="110"/>
+              <w:bottom w:type="dxa" w:w="70"/>
+              <w:right w:type="dxa" w:w="110"/>
+            </w:tcMar>
+            <w:vAlign w:val="center"/>
+          </w:tcPr>
+          <w:p>
+            <w:pPr>
+              <w:spacing w:after="0" w:line="264"/>
+            </w:pPr>
+            <w:r>
+              <w:rPr>
+                <w:rFonts w:ascii="Arial" w:cs="Arial" w:eastAsia="Arial" w:hAnsi="Arial"/>
+                <w:color w:val="1B1C24"/>
+                <w:sz w:val="20"/>
+                <w:szCs w:val="20"/>
+              </w:rPr>
+              <w:t xml:space="preserve">6</w:t>
+            </w:r>
+          </w:p>
+        </w:tc>
+        <w:tc>
+          <w:tcPr>
+            <w:tcW w:type="dxa" w:w="4800"/>
+            <w:shd w:fill="F7F8FA" w:val="clear"/>
+            <w:tcMar>
+              <w:top w:type="dxa" w:w="70"/>
+              <w:left w:type="dxa" w:w="110"/>
+              <w:bottom w:type="dxa" w:w="70"/>
+              <w:right w:type="dxa" w:w="110"/>
+            </w:tcMar>
+            <w:vAlign w:val="center"/>
+          </w:tcPr>
+          <w:p>
+            <w:pPr>
+              <w:spacing w:after="0" w:line="264"/>
+            </w:pPr>
+            <w:r>
+              <w:rPr>
+                <w:rFonts w:ascii="Arial" w:cs="Arial" w:eastAsia="Arial" w:hAnsi="Arial"/>
+                <w:color w:val="1B1C24"/>
+                <w:sz w:val="20"/>
+                <w:szCs w:val="20"/>
+              </w:rPr>
+              <w:t xml:space="preserve">M04 · Hanbok y estética</w:t>
+            </w:r>
+          </w:p>
+        </w:tc>
+        <w:tc>
+          <w:tcPr>
+            <w:tcW w:type="dxa" w:w="4000"/>
+            <w:shd w:fill="F7F8FA" w:val="clear"/>
+            <w:tcMar>
+              <w:top w:type="dxa" w:w="70"/>
+              <w:left w:type="dxa" w:w="110"/>
+              <w:bottom w:type="dxa" w:w="70"/>
+              <w:right w:type="dxa" w:w="110"/>
+            </w:tcMar>
+            <w:vAlign w:val="center"/>
+          </w:tcPr>
+          <w:p>
+            <w:pPr>
+              <w:spacing w:after="0" w:line="264"/>
+            </w:pPr>
+            <w:r>
+              <w:rPr>
+                <w:rFonts w:ascii="Arial" w:cs="Arial" w:eastAsia="Arial" w:hAnsi="Arial"/>
+                <w:color w:val="1B1C24"/>
+                <w:sz w:val="20"/>
+                <w:szCs w:val="20"/>
+              </w:rPr>
+              <w:t xml:space="preserve">Describir y opinar</w:t>
+            </w:r>
+          </w:p>
+        </w:tc>
+      </w:tr>
+      <w:tr>
+        <w:tc>
+          <w:tcPr>
+            <w:tcW w:type="dxa" w:w="560"/>
+            <w:tcMar>
+              <w:top w:type="dxa" w:w="70"/>
+              <w:left w:type="dxa" w:w="110"/>
+              <w:bottom w:type="dxa" w:w="70"/>
+              <w:right w:type="dxa" w:w="110"/>
+            </w:tcMar>
+            <w:vAlign w:val="center"/>
+          </w:tcPr>
+          <w:p>
+            <w:pPr>
+              <w:spacing w:after="0" w:line="264"/>
+            </w:pPr>
+            <w:r>
+              <w:rPr>
+                <w:rFonts w:ascii="Arial" w:cs="Arial" w:eastAsia="Arial" w:hAnsi="Arial"/>
+                <w:color w:val="1B1C24"/>
+                <w:sz w:val="20"/>
+                <w:szCs w:val="20"/>
+              </w:rPr>
+              <w:t xml:space="preserve">7</w:t>
+            </w:r>
+          </w:p>
+        </w:tc>
+        <w:tc>
+          <w:tcPr>
+            <w:tcW w:type="dxa" w:w="4800"/>
+            <w:tcMar>
+              <w:top w:type="dxa" w:w="70"/>
+              <w:left w:type="dxa" w:w="110"/>
+              <w:bottom w:type="dxa" w:w="70"/>
+              <w:right w:type="dxa" w:w="110"/>
+            </w:tcMar>
+            <w:vAlign w:val="center"/>
+          </w:tcPr>
+          <w:p>
+            <w:pPr>
+              <w:spacing w:after="0" w:line="264"/>
+            </w:pPr>
+            <w:r>
+              <w:rPr>
+                <w:rFonts w:ascii="Arial" w:cs="Arial" w:eastAsia="Arial" w:hAnsi="Arial"/>
+                <w:color w:val="1B1C24"/>
+                <w:sz w:val="20"/>
+                <w:szCs w:val="20"/>
+              </w:rPr>
+              <w:t xml:space="preserve">M05 · PC방 y e-sports</w:t>
+            </w:r>
+          </w:p>
+        </w:tc>
+        <w:tc>
+          <w:tcPr>
+            <w:tcW w:type="dxa" w:w="4000"/>
+            <w:tcMar>
+              <w:top w:type="dxa" w:w="70"/>
+              <w:left w:type="dxa" w:w="110"/>
+              <w:bottom w:type="dxa" w:w="70"/>
+              <w:right w:type="dxa" w:w="110"/>
+            </w:tcMar>
+            <w:vAlign w:val="center"/>
+          </w:tcPr>
+          <w:p>
+            <w:pPr>
+              <w:spacing w:after="0" w:line="264"/>
+            </w:pPr>
+            <w:r>
+              <w:rPr>
+                <w:rFonts w:ascii="Arial" w:cs="Arial" w:eastAsia="Arial" w:hAnsi="Arial"/>
+                <w:color w:val="1B1C24"/>
+                <w:sz w:val="20"/>
+                <w:szCs w:val="20"/>
+              </w:rPr>
+              <w:t xml:space="preserve">La Corea gamer</w:t>
+            </w:r>
+          </w:p>
+        </w:tc>
+      </w:tr>
+      <w:tr>
+        <w:tc>
+          <w:tcPr>
+            <w:tcW w:type="dxa" w:w="560"/>
+            <w:shd w:fill="F7F8FA" w:val="clear"/>
+            <w:tcMar>
+              <w:top w:type="dxa" w:w="70"/>
+              <w:left w:type="dxa" w:w="110"/>
+              <w:bottom w:type="dxa" w:w="70"/>
+              <w:right w:type="dxa" w:w="110"/>
+            </w:tcMar>
+            <w:vAlign w:val="center"/>
+          </w:tcPr>
+          <w:p>
+            <w:pPr>
+              <w:spacing w:after="0" w:line="264"/>
+            </w:pPr>
+            <w:r>
+              <w:rPr>
+                <w:rFonts w:ascii="Arial" w:cs="Arial" w:eastAsia="Arial" w:hAnsi="Arial"/>
+                <w:color w:val="1B1C24"/>
+                <w:sz w:val="20"/>
+                <w:szCs w:val="20"/>
+              </w:rPr>
+              <w:t xml:space="preserve">8</w:t>
+            </w:r>
+          </w:p>
+        </w:tc>
+        <w:tc>
+          <w:tcPr>
+            <w:tcW w:type="dxa" w:w="4800"/>
+            <w:shd w:fill="F7F8FA" w:val="clear"/>
+            <w:tcMar>
+              <w:top w:type="dxa" w:w="70"/>
+              <w:left w:type="dxa" w:w="110"/>
+              <w:bottom w:type="dxa" w:w="70"/>
+              <w:right w:type="dxa" w:w="110"/>
+            </w:tcMar>
+            <w:vAlign w:val="center"/>
+          </w:tcPr>
+          <w:p>
+            <w:pPr>
+              <w:spacing w:after="0" w:line="264"/>
+            </w:pPr>
+            <w:r>
+              <w:rPr>
+                <w:rFonts w:ascii="Arial" w:cs="Arial" w:eastAsia="Arial" w:hAnsi="Arial"/>
+                <w:color w:val="1B1C24"/>
+                <w:sz w:val="20"/>
+                <w:szCs w:val="20"/>
+              </w:rPr>
+              <w:t xml:space="preserve">Lab 2 + evaluación oral de etapa</w:t>
+            </w:r>
+          </w:p>
+        </w:tc>
+        <w:tc>
+          <w:tcPr>
+            <w:tcW w:type="dxa" w:w="4000"/>
+            <w:shd w:fill="F7F8FA" w:val="clear"/>
+            <w:tcMar>
+              <w:top w:type="dxa" w:w="70"/>
+              <w:left w:type="dxa" w:w="110"/>
+              <w:bottom w:type="dxa" w:w="70"/>
+              <w:right w:type="dxa" w:w="110"/>
+            </w:tcMar>
+            <w:vAlign w:val="center"/>
+          </w:tcPr>
+          <w:p>
+            <w:pPr>
+              <w:spacing w:after="0" w:line="264"/>
+            </w:pPr>
+            <w:r>
+              <w:rPr>
+                <w:rFonts w:ascii="Arial" w:cs="Arial" w:eastAsia="Arial" w:hAnsi="Arial"/>
+                <w:color w:val="1B1C24"/>
+                <w:sz w:val="20"/>
+                <w:szCs w:val="20"/>
+              </w:rPr>
+              <w:t xml:space="preserve">Certificado A2.1 · invitación a A2.2</w:t>
+            </w:r>
+          </w:p>
+        </w:tc>
+      </w:tr>
+    </w:tbl>
+    <w:p>
+      <w:pPr>
+        <w:keepNext/>
+        <w:spacing w:after="100" w:before="240"/>
+      </w:pPr>
+      <w:r>
+        <w:rPr>
+          <w:rFonts w:ascii="Arial" w:cs="Arial" w:eastAsia="Arial" w:hAnsi="Arial"/>
+          <w:b/>
+          <w:bCs/>
+          <w:color w:val="C8001E"/>
+          <w:sz w:val="22"/>
+          <w:szCs w:val="22"/>
+        </w:rPr>
+        <w:t xml:space="preserve">4.2 Conversacional A2.2 · “Corea por dentro” (con Abby)</w:t>
+      </w:r>
+    </w:p>
+    <w:tbl>
+      <w:tblPr>
+        <w:tblW w:type="dxa" w:w="9360"/>
+        <w:tblBorders>
+          <w:top w:val="single" w:color="CCCCCC" w:sz="4"/>
+          <w:left w:val="single" w:color="CCCCCC" w:sz="4"/>
+          <w:bottom w:val="single" w:color="CCCCCC" w:sz="4"/>
+          <w:right w:val="single" w:color="CCCCCC" w:sz="4"/>
+          <w:insideH w:val="single" w:color="CCCCCC" w:sz="4"/>
+          <w:insideV w:val="single" w:color="CCCCCC" w:sz="4"/>
+        </w:tblBorders>
+      </w:tblPr>
+      <w:tblGrid>
+        <w:gridCol w:w="560"/>
+        <w:gridCol w:w="4800"/>
+        <w:gridCol w:w="4000"/>
+      </w:tblGrid>
+      <w:tr>
+        <w:trPr>
+          <w:tblHeader/>
+        </w:trPr>
+        <w:tc>
+          <w:tcPr>
+            <w:tcW w:type="dxa" w:w="560"/>
+            <w:shd w:fill="003478" w:val="clear"/>
+            <w:tcMar>
+              <w:top w:type="dxa" w:w="70"/>
+              <w:left w:type="dxa" w:w="110"/>
+              <w:bottom w:type="dxa" w:w="70"/>
+              <w:right w:type="dxa" w:w="110"/>
+            </w:tcMar>
+            <w:vAlign w:val="center"/>
+          </w:tcPr>
+          <w:p>
+            <w:pPr>
+              <w:spacing w:after="0" w:line="264"/>
+            </w:pPr>
+            <w:r>
+              <w:rPr>
+                <w:rFonts w:ascii="Arial" w:cs="Arial" w:eastAsia="Arial" w:hAnsi="Arial"/>
+                <w:b/>
+                <w:bCs/>
+                <w:color w:val="FFFFFF"/>
+                <w:sz w:val="20"/>
+                <w:szCs w:val="20"/>
+              </w:rPr>
+              <w:t xml:space="preserve">Clase</w:t>
+            </w:r>
+          </w:p>
+        </w:tc>
+        <w:tc>
+          <w:tcPr>
+            <w:tcW w:type="dxa" w:w="4800"/>
+            <w:shd w:fill="003478" w:val="clear"/>
+            <w:tcMar>
+              <w:top w:type="dxa" w:w="70"/>
+              <w:left w:type="dxa" w:w="110"/>
+              <w:bottom w:type="dxa" w:w="70"/>
+              <w:right w:type="dxa" w:w="110"/>
+            </w:tcMar>
+            <w:vAlign w:val="center"/>
+          </w:tcPr>
+          <w:p>
+            <w:pPr>
+              <w:spacing w:after="0" w:line="264"/>
+            </w:pPr>
+            <w:r>
+              <w:rPr>
+                <w:rFonts w:ascii="Arial" w:cs="Arial" w:eastAsia="Arial" w:hAnsi="Arial"/>
+                <w:b/>
+                <w:bCs/>
+                <w:color w:val="FFFFFF"/>
+                <w:sz w:val="20"/>
+                <w:szCs w:val="20"/>
+              </w:rPr>
+              <w:t xml:space="preserve">Contenido (decks ya producidos)</w:t>
+            </w:r>
+          </w:p>
+        </w:tc>
+        <w:tc>
+          <w:tcPr>
+            <w:tcW w:type="dxa" w:w="4000"/>
+            <w:shd w:fill="003478" w:val="clear"/>
+            <w:tcMar>
+              <w:top w:type="dxa" w:w="70"/>
+              <w:left w:type="dxa" w:w="110"/>
+              <w:bottom w:type="dxa" w:w="70"/>
+              <w:right w:type="dxa" w:w="110"/>
+            </w:tcMar>
+            <w:vAlign w:val="center"/>
+          </w:tcPr>
+          <w:p>
+            <w:pPr>
+              <w:spacing w:after="0" w:line="264"/>
+            </w:pPr>
+            <w:r>
+              <w:rPr>
+                <w:rFonts w:ascii="Arial" w:cs="Arial" w:eastAsia="Arial" w:hAnsi="Arial"/>
+                <w:b/>
+                <w:bCs/>
+                <w:color w:val="FFFFFF"/>
+                <w:sz w:val="20"/>
+                <w:szCs w:val="20"/>
+              </w:rPr>
+              <w:t xml:space="preserve">Foco</w:t>
+            </w:r>
+          </w:p>
+        </w:tc>
+      </w:tr>
+      <w:tr>
+        <w:tc>
+          <w:tcPr>
+            <w:tcW w:type="dxa" w:w="560"/>
+            <w:tcMar>
+              <w:top w:type="dxa" w:w="70"/>
+              <w:left w:type="dxa" w:w="110"/>
+              <w:bottom w:type="dxa" w:w="70"/>
+              <w:right w:type="dxa" w:w="110"/>
+            </w:tcMar>
+            <w:vAlign w:val="center"/>
+          </w:tcPr>
+          <w:p>
+            <w:pPr>
+              <w:spacing w:after="0" w:line="264"/>
+            </w:pPr>
+            <w:r>
+              <w:rPr>
+                <w:rFonts w:ascii="Arial" w:cs="Arial" w:eastAsia="Arial" w:hAnsi="Arial"/>
+                <w:color w:val="1B1C24"/>
+                <w:sz w:val="20"/>
+                <w:szCs w:val="20"/>
+              </w:rPr>
+              <w:t xml:space="preserve">1</w:t>
+            </w:r>
+          </w:p>
+        </w:tc>
+        <w:tc>
+          <w:tcPr>
+            <w:tcW w:type="dxa" w:w="4800"/>
+            <w:tcMar>
+              <w:top w:type="dxa" w:w="70"/>
+              <w:left w:type="dxa" w:w="110"/>
+              <w:bottom w:type="dxa" w:w="70"/>
+              <w:right w:type="dxa" w:w="110"/>
+            </w:tcMar>
+            <w:vAlign w:val="center"/>
+          </w:tcPr>
+          <w:p>
+            <w:pPr>
+              <w:spacing w:after="0" w:line="264"/>
+            </w:pPr>
+            <w:r>
+              <w:rPr>
+                <w:rFonts w:ascii="Arial" w:cs="Arial" w:eastAsia="Arial" w:hAnsi="Arial"/>
+                <w:color w:val="1B1C24"/>
+                <w:sz w:val="20"/>
+                <w:szCs w:val="20"/>
+              </w:rPr>
+              <w:t xml:space="preserve">Reconexión oral + repaso activo de A2.1</w:t>
+            </w:r>
+          </w:p>
+        </w:tc>
+        <w:tc>
+          <w:tcPr>
+            <w:tcW w:type="dxa" w:w="4000"/>
+            <w:tcMar>
+              <w:top w:type="dxa" w:w="70"/>
+              <w:left w:type="dxa" w:w="110"/>
+              <w:bottom w:type="dxa" w:w="70"/>
+              <w:right w:type="dxa" w:w="110"/>
+            </w:tcMar>
+            <w:vAlign w:val="center"/>
+          </w:tcPr>
+          <w:p>
+            <w:pPr>
+              <w:spacing w:after="0" w:line="264"/>
+            </w:pPr>
+            <w:r>
+              <w:rPr>
+                <w:rFonts w:ascii="Arial" w:cs="Arial" w:eastAsia="Arial" w:hAnsi="Arial"/>
+                <w:color w:val="1B1C24"/>
+                <w:sz w:val="20"/>
+                <w:szCs w:val="20"/>
+              </w:rPr>
+              <w:t xml:space="preserve">Diagnóstico · reactivar</w:t>
+            </w:r>
+          </w:p>
+        </w:tc>
+      </w:tr>
+      <w:tr>
+        <w:tc>
+          <w:tcPr>
+            <w:tcW w:type="dxa" w:w="560"/>
+            <w:shd w:fill="F7F8FA" w:val="clear"/>
+            <w:tcMar>
+              <w:top w:type="dxa" w:w="70"/>
+              <w:left w:type="dxa" w:w="110"/>
+              <w:bottom w:type="dxa" w:w="70"/>
+              <w:right w:type="dxa" w:w="110"/>
+            </w:tcMar>
+            <w:vAlign w:val="center"/>
+          </w:tcPr>
+          <w:p>
+            <w:pPr>
+              <w:spacing w:after="0" w:line="264"/>
+            </w:pPr>
+            <w:r>
+              <w:rPr>
+                <w:rFonts w:ascii="Arial" w:cs="Arial" w:eastAsia="Arial" w:hAnsi="Arial"/>
+                <w:color w:val="1B1C24"/>
+                <w:sz w:val="20"/>
+                <w:szCs w:val="20"/>
+              </w:rPr>
+              <w:t xml:space="preserve">2</w:t>
+            </w:r>
+          </w:p>
+        </w:tc>
+        <w:tc>
+          <w:tcPr>
+            <w:tcW w:type="dxa" w:w="4800"/>
+            <w:shd w:fill="F7F8FA" w:val="clear"/>
+            <w:tcMar>
+              <w:top w:type="dxa" w:w="70"/>
+              <w:left w:type="dxa" w:w="110"/>
+              <w:bottom w:type="dxa" w:w="70"/>
+              <w:right w:type="dxa" w:w="110"/>
+            </w:tcMar>
+            <w:vAlign w:val="center"/>
+          </w:tcPr>
+          <w:p>
+            <w:pPr>
+              <w:spacing w:after="0" w:line="264"/>
+            </w:pPr>
+            <w:r>
+              <w:rPr>
+                <w:rFonts w:ascii="Arial" w:cs="Arial" w:eastAsia="Arial" w:hAnsi="Arial"/>
+                <w:color w:val="1B1C24"/>
+                <w:sz w:val="20"/>
+                <w:szCs w:val="20"/>
+              </w:rPr>
+              <w:t xml:space="preserve">M06 · Educación y suneung</w:t>
+            </w:r>
+          </w:p>
+        </w:tc>
+        <w:tc>
+          <w:tcPr>
+            <w:tcW w:type="dxa" w:w="4000"/>
+            <w:shd w:fill="F7F8FA" w:val="clear"/>
+            <w:tcMar>
+              <w:top w:type="dxa" w:w="70"/>
+              <w:left w:type="dxa" w:w="110"/>
+              <w:bottom w:type="dxa" w:w="70"/>
+              <w:right w:type="dxa" w:w="110"/>
+            </w:tcMar>
+            <w:vAlign w:val="center"/>
+          </w:tcPr>
+          <w:p>
+            <w:pPr>
+              <w:spacing w:after="0" w:line="264"/>
+            </w:pPr>
+            <w:r>
+              <w:rPr>
+                <w:rFonts w:ascii="Arial" w:cs="Arial" w:eastAsia="Arial" w:hAnsi="Arial"/>
+                <w:color w:val="1B1C24"/>
+                <w:sz w:val="20"/>
+                <w:szCs w:val="20"/>
+              </w:rPr>
+              <w:t xml:space="preserve">La presión y los sueños</w:t>
+            </w:r>
+          </w:p>
+        </w:tc>
+      </w:tr>
+      <w:tr>
+        <w:tc>
+          <w:tcPr>
+            <w:tcW w:type="dxa" w:w="560"/>
+            <w:tcMar>
+              <w:top w:type="dxa" w:w="70"/>
+              <w:left w:type="dxa" w:w="110"/>
+              <w:bottom w:type="dxa" w:w="70"/>
+              <w:right w:type="dxa" w:w="110"/>
+            </w:tcMar>
+            <w:vAlign w:val="center"/>
+          </w:tcPr>
+          <w:p>
+            <w:pPr>
+              <w:spacing w:after="0" w:line="264"/>
+            </w:pPr>
+            <w:r>
+              <w:rPr>
+                <w:rFonts w:ascii="Arial" w:cs="Arial" w:eastAsia="Arial" w:hAnsi="Arial"/>
+                <w:color w:val="1B1C24"/>
+                <w:sz w:val="20"/>
+                <w:szCs w:val="20"/>
+              </w:rPr>
+              <w:t xml:space="preserve">3</w:t>
+            </w:r>
+          </w:p>
+        </w:tc>
+        <w:tc>
+          <w:tcPr>
+            <w:tcW w:type="dxa" w:w="4800"/>
+            <w:tcMar>
+              <w:top w:type="dxa" w:w="70"/>
+              <w:left w:type="dxa" w:w="110"/>
+              <w:bottom w:type="dxa" w:w="70"/>
+              <w:right w:type="dxa" w:w="110"/>
+            </w:tcMar>
+            <w:vAlign w:val="center"/>
+          </w:tcPr>
+          <w:p>
+            <w:pPr>
+              <w:spacing w:after="0" w:line="264"/>
+            </w:pPr>
+            <w:r>
+              <w:rPr>
+                <w:rFonts w:ascii="Arial" w:cs="Arial" w:eastAsia="Arial" w:hAnsi="Arial"/>
+                <w:color w:val="1B1C24"/>
+                <w:sz w:val="20"/>
+                <w:szCs w:val="20"/>
+              </w:rPr>
+              <w:t xml:space="preserve">M07 · Trabajo y hoesik</w:t>
+            </w:r>
+          </w:p>
+        </w:tc>
+        <w:tc>
+          <w:tcPr>
+            <w:tcW w:type="dxa" w:w="4000"/>
+            <w:tcMar>
+              <w:top w:type="dxa" w:w="70"/>
+              <w:left w:type="dxa" w:w="110"/>
+              <w:bottom w:type="dxa" w:w="70"/>
+              <w:right w:type="dxa" w:w="110"/>
+            </w:tcMar>
+            <w:vAlign w:val="center"/>
+          </w:tcPr>
+          <w:p>
+            <w:pPr>
+              <w:spacing w:after="0" w:line="264"/>
+            </w:pPr>
+            <w:r>
+              <w:rPr>
+                <w:rFonts w:ascii="Arial" w:cs="Arial" w:eastAsia="Arial" w:hAnsi="Arial"/>
+                <w:color w:val="1B1C24"/>
+                <w:sz w:val="20"/>
+                <w:szCs w:val="20"/>
+              </w:rPr>
+              <w:t xml:space="preserve">La oficina coreana</w:t>
+            </w:r>
+          </w:p>
+        </w:tc>
+      </w:tr>
+      <w:tr>
+        <w:tc>
+          <w:tcPr>
+            <w:tcW w:type="dxa" w:w="560"/>
+            <w:shd w:fill="F7F8FA" w:val="clear"/>
+            <w:tcMar>
+              <w:top w:type="dxa" w:w="70"/>
+              <w:left w:type="dxa" w:w="110"/>
+              <w:bottom w:type="dxa" w:w="70"/>
+              <w:right w:type="dxa" w:w="110"/>
+            </w:tcMar>
+            <w:vAlign w:val="center"/>
+          </w:tcPr>
+          <w:p>
+            <w:pPr>
+              <w:spacing w:after="0" w:line="264"/>
+            </w:pPr>
+            <w:r>
+              <w:rPr>
+                <w:rFonts w:ascii="Arial" w:cs="Arial" w:eastAsia="Arial" w:hAnsi="Arial"/>
+                <w:color w:val="1B1C24"/>
+                <w:sz w:val="20"/>
+                <w:szCs w:val="20"/>
+              </w:rPr>
+              <w:t xml:space="preserve">4</w:t>
+            </w:r>
+          </w:p>
+        </w:tc>
+        <w:tc>
+          <w:tcPr>
+            <w:tcW w:type="dxa" w:w="4800"/>
+            <w:shd w:fill="F7F8FA" w:val="clear"/>
+            <w:tcMar>
+              <w:top w:type="dxa" w:w="70"/>
+              <w:left w:type="dxa" w:w="110"/>
+              <w:bottom w:type="dxa" w:w="70"/>
+              <w:right w:type="dxa" w:w="110"/>
+            </w:tcMar>
+            <w:vAlign w:val="center"/>
+          </w:tcPr>
+          <w:p>
+            <w:pPr>
+              <w:spacing w:after="0" w:line="264"/>
+            </w:pPr>
+            <w:r>
+              <w:rPr>
+                <w:rFonts w:ascii="Arial" w:cs="Arial" w:eastAsia="Arial" w:hAnsi="Arial"/>
+                <w:color w:val="1B1C24"/>
+                <w:sz w:val="20"/>
+                <w:szCs w:val="20"/>
+              </w:rPr>
+              <w:t xml:space="preserve">Lab de conversación 3 (módulos 6–7)</w:t>
+            </w:r>
+          </w:p>
+        </w:tc>
+        <w:tc>
+          <w:tcPr>
+            <w:tcW w:type="dxa" w:w="4000"/>
+            <w:shd w:fill="F7F8FA" w:val="clear"/>
+            <w:tcMar>
+              <w:top w:type="dxa" w:w="70"/>
+              <w:left w:type="dxa" w:w="110"/>
+              <w:bottom w:type="dxa" w:w="70"/>
+              <w:right w:type="dxa" w:w="110"/>
+            </w:tcMar>
+            <w:vAlign w:val="center"/>
+          </w:tcPr>
+          <w:p>
+            <w:pPr>
+              <w:spacing w:after="0" w:line="264"/>
+            </w:pPr>
+            <w:r>
+              <w:rPr>
+                <w:rFonts w:ascii="Arial" w:cs="Arial" w:eastAsia="Arial" w:hAnsi="Arial"/>
+                <w:color w:val="1B1C24"/>
+                <w:sz w:val="20"/>
+                <w:szCs w:val="20"/>
+              </w:rPr>
+              <w:t xml:space="preserve">Práctica oral pura</w:t>
+            </w:r>
+          </w:p>
+        </w:tc>
+      </w:tr>
+      <w:tr>
+        <w:tc>
+          <w:tcPr>
+            <w:tcW w:type="dxa" w:w="560"/>
+            <w:tcMar>
+              <w:top w:type="dxa" w:w="70"/>
+              <w:left w:type="dxa" w:w="110"/>
+              <w:bottom w:type="dxa" w:w="70"/>
+              <w:right w:type="dxa" w:w="110"/>
+            </w:tcMar>
+            <w:vAlign w:val="center"/>
+          </w:tcPr>
+          <w:p>
+            <w:pPr>
+              <w:spacing w:after="0" w:line="264"/>
+            </w:pPr>
+            <w:r>
+              <w:rPr>
+                <w:rFonts w:ascii="Arial" w:cs="Arial" w:eastAsia="Arial" w:hAnsi="Arial"/>
+                <w:color w:val="1B1C24"/>
+                <w:sz w:val="20"/>
+                <w:szCs w:val="20"/>
+              </w:rPr>
+              <w:t xml:space="preserve">5</w:t>
+            </w:r>
+          </w:p>
+        </w:tc>
+        <w:tc>
+          <w:tcPr>
+            <w:tcW w:type="dxa" w:w="4800"/>
+            <w:tcMar>
+              <w:top w:type="dxa" w:w="70"/>
+              <w:left w:type="dxa" w:w="110"/>
+              <w:bottom w:type="dxa" w:w="70"/>
+              <w:right w:type="dxa" w:w="110"/>
+            </w:tcMar>
+            <w:vAlign w:val="center"/>
+          </w:tcPr>
+          <w:p>
+            <w:pPr>
+              <w:spacing w:after="0" w:line="264"/>
+            </w:pPr>
+            <w:r>
+              <w:rPr>
+                <w:rFonts w:ascii="Arial" w:cs="Arial" w:eastAsia="Arial" w:hAnsi="Arial"/>
+                <w:color w:val="1B1C24"/>
+                <w:sz w:val="20"/>
+                <w:szCs w:val="20"/>
+              </w:rPr>
+              <w:t xml:space="preserve">M08 · Folclore y mitos</w:t>
+            </w:r>
+          </w:p>
+        </w:tc>
+        <w:tc>
+          <w:tcPr>
+            <w:tcW w:type="dxa" w:w="4000"/>
+            <w:tcMar>
+              <w:top w:type="dxa" w:w="70"/>
+              <w:left w:type="dxa" w:w="110"/>
+              <w:bottom w:type="dxa" w:w="70"/>
+              <w:right w:type="dxa" w:w="110"/>
+            </w:tcMar>
+            <w:vAlign w:val="center"/>
+          </w:tcPr>
+          <w:p>
+            <w:pPr>
+              <w:spacing w:after="0" w:line="264"/>
+            </w:pPr>
+            <w:r>
+              <w:rPr>
+                <w:rFonts w:ascii="Arial" w:cs="Arial" w:eastAsia="Arial" w:hAnsi="Arial"/>
+                <w:color w:val="1B1C24"/>
+                <w:sz w:val="20"/>
+                <w:szCs w:val="20"/>
+              </w:rPr>
+              <w:t xml:space="preserve">Narrar historias</w:t>
+            </w:r>
+          </w:p>
+        </w:tc>
+      </w:tr>
+      <w:tr>
+        <w:tc>
+          <w:tcPr>
+            <w:tcW w:type="dxa" w:w="560"/>
+            <w:shd w:fill="F7F8FA" w:val="clear"/>
+            <w:tcMar>
+              <w:top w:type="dxa" w:w="70"/>
+              <w:left w:type="dxa" w:w="110"/>
+              <w:bottom w:type="dxa" w:w="70"/>
+              <w:right w:type="dxa" w:w="110"/>
+            </w:tcMar>
+            <w:vAlign w:val="center"/>
+          </w:tcPr>
+          <w:p>
+            <w:pPr>
+              <w:spacing w:after="0" w:line="264"/>
+            </w:pPr>
+            <w:r>
+              <w:rPr>
+                <w:rFonts w:ascii="Arial" w:cs="Arial" w:eastAsia="Arial" w:hAnsi="Arial"/>
+                <w:color w:val="1B1C24"/>
+                <w:sz w:val="20"/>
+                <w:szCs w:val="20"/>
+              </w:rPr>
+              <w:t xml:space="preserve">6</w:t>
+            </w:r>
+          </w:p>
+        </w:tc>
+        <w:tc>
+          <w:tcPr>
+            <w:tcW w:type="dxa" w:w="4800"/>
+            <w:shd w:fill="F7F8FA" w:val="clear"/>
+            <w:tcMar>
+              <w:top w:type="dxa" w:w="70"/>
+              <w:left w:type="dxa" w:w="110"/>
+              <w:bottom w:type="dxa" w:w="70"/>
+              <w:right w:type="dxa" w:w="110"/>
+            </w:tcMar>
+            <w:vAlign w:val="center"/>
+          </w:tcPr>
+          <w:p>
+            <w:pPr>
+              <w:spacing w:after="0" w:line="264"/>
+            </w:pPr>
+            <w:r>
+              <w:rPr>
+                <w:rFonts w:ascii="Arial" w:cs="Arial" w:eastAsia="Arial" w:hAnsi="Arial"/>
+                <w:color w:val="1B1C24"/>
+                <w:sz w:val="20"/>
+                <w:szCs w:val="20"/>
+              </w:rPr>
+              <w:t xml:space="preserve">M09 · Fiestas: Seollal y Chuseok (deck de Abby)</w:t>
+            </w:r>
+          </w:p>
+        </w:tc>
+        <w:tc>
+          <w:tcPr>
+            <w:tcW w:type="dxa" w:w="4000"/>
+            <w:shd w:fill="F7F8FA" w:val="clear"/>
+            <w:tcMar>
+              <w:top w:type="dxa" w:w="70"/>
+              <w:left w:type="dxa" w:w="110"/>
+              <w:bottom w:type="dxa" w:w="70"/>
+              <w:right w:type="dxa" w:w="110"/>
+            </w:tcMar>
+            <w:vAlign w:val="center"/>
+          </w:tcPr>
+          <w:p>
+            <w:pPr>
+              <w:spacing w:after="0" w:line="264"/>
+            </w:pPr>
+            <w:r>
+              <w:rPr>
+                <w:rFonts w:ascii="Arial" w:cs="Arial" w:eastAsia="Arial" w:hAnsi="Arial"/>
+                <w:color w:val="1B1C24"/>
+                <w:sz w:val="20"/>
+                <w:szCs w:val="20"/>
+              </w:rPr>
+              <w:t xml:space="preserve">Tradiciones en primera persona</w:t>
+            </w:r>
+          </w:p>
+        </w:tc>
+      </w:tr>
+      <w:tr>
+        <w:tc>
+          <w:tcPr>
+            <w:tcW w:type="dxa" w:w="560"/>
+            <w:tcMar>
+              <w:top w:type="dxa" w:w="70"/>
+              <w:left w:type="dxa" w:w="110"/>
+              <w:bottom w:type="dxa" w:w="70"/>
+              <w:right w:type="dxa" w:w="110"/>
+            </w:tcMar>
+            <w:vAlign w:val="center"/>
+          </w:tcPr>
+          <w:p>
+            <w:pPr>
+              <w:spacing w:after="0" w:line="264"/>
+            </w:pPr>
+            <w:r>
+              <w:rPr>
+                <w:rFonts w:ascii="Arial" w:cs="Arial" w:eastAsia="Arial" w:hAnsi="Arial"/>
+                <w:color w:val="1B1C24"/>
+                <w:sz w:val="20"/>
+                <w:szCs w:val="20"/>
+              </w:rPr>
+              <w:t xml:space="preserve">7</w:t>
+            </w:r>
+          </w:p>
+        </w:tc>
+        <w:tc>
+          <w:tcPr>
+            <w:tcW w:type="dxa" w:w="4800"/>
+            <w:tcMar>
+              <w:top w:type="dxa" w:w="70"/>
+              <w:left w:type="dxa" w:w="110"/>
+              <w:bottom w:type="dxa" w:w="70"/>
+              <w:right w:type="dxa" w:w="110"/>
+            </w:tcMar>
+            <w:vAlign w:val="center"/>
+          </w:tcPr>
+          <w:p>
+            <w:pPr>
+              <w:spacing w:after="0" w:line="264"/>
+            </w:pPr>
+            <w:r>
+              <w:rPr>
+                <w:rFonts w:ascii="Arial" w:cs="Arial" w:eastAsia="Arial" w:hAnsi="Arial"/>
+                <w:color w:val="1B1C24"/>
+                <w:sz w:val="20"/>
+                <w:szCs w:val="20"/>
+              </w:rPr>
+              <w:t xml:space="preserve">M10 · K-Drama y medios</w:t>
+            </w:r>
+          </w:p>
+        </w:tc>
+        <w:tc>
+          <w:tcPr>
+            <w:tcW w:type="dxa" w:w="4000"/>
+            <w:tcMar>
+              <w:top w:type="dxa" w:w="70"/>
+              <w:left w:type="dxa" w:w="110"/>
+              <w:bottom w:type="dxa" w:w="70"/>
+              <w:right w:type="dxa" w:w="110"/>
+            </w:tcMar>
+            <w:vAlign w:val="center"/>
+          </w:tcPr>
+          <w:p>
+            <w:pPr>
+              <w:spacing w:after="0" w:line="264"/>
+            </w:pPr>
+            <w:r>
+              <w:rPr>
+                <w:rFonts w:ascii="Arial" w:cs="Arial" w:eastAsia="Arial" w:hAnsi="Arial"/>
+                <w:color w:val="1B1C24"/>
+                <w:sz w:val="20"/>
+                <w:szCs w:val="20"/>
+              </w:rPr>
+              <w:t xml:space="preserve">Opinar sobre lo que ves</w:t>
+            </w:r>
+          </w:p>
+        </w:tc>
+      </w:tr>
+      <w:tr>
+        <w:tc>
+          <w:tcPr>
+            <w:tcW w:type="dxa" w:w="560"/>
+            <w:shd w:fill="F7F8FA" w:val="clear"/>
+            <w:tcMar>
+              <w:top w:type="dxa" w:w="70"/>
+              <w:left w:type="dxa" w:w="110"/>
+              <w:bottom w:type="dxa" w:w="70"/>
+              <w:right w:type="dxa" w:w="110"/>
+            </w:tcMar>
+            <w:vAlign w:val="center"/>
+          </w:tcPr>
+          <w:p>
+            <w:pPr>
+              <w:spacing w:after="0" w:line="264"/>
+            </w:pPr>
+            <w:r>
+              <w:rPr>
+                <w:rFonts w:ascii="Arial" w:cs="Arial" w:eastAsia="Arial" w:hAnsi="Arial"/>
+                <w:color w:val="1B1C24"/>
+                <w:sz w:val="20"/>
+                <w:szCs w:val="20"/>
+              </w:rPr>
+              <w:t xml:space="preserve">8</w:t>
+            </w:r>
+          </w:p>
+        </w:tc>
+        <w:tc>
+          <w:tcPr>
+            <w:tcW w:type="dxa" w:w="4800"/>
+            <w:shd w:fill="F7F8FA" w:val="clear"/>
+            <w:tcMar>
+              <w:top w:type="dxa" w:w="70"/>
+              <w:left w:type="dxa" w:w="110"/>
+              <w:bottom w:type="dxa" w:w="70"/>
+              <w:right w:type="dxa" w:w="110"/>
+            </w:tcMar>
+            <w:vAlign w:val="center"/>
+          </w:tcPr>
+          <w:p>
+            <w:pPr>
+              <w:spacing w:after="0" w:line="264"/>
+            </w:pPr>
+            <w:r>
+              <w:rPr>
+                <w:rFonts w:ascii="Arial" w:cs="Arial" w:eastAsia="Arial" w:hAnsi="Arial"/>
+                <w:color w:val="1B1C24"/>
+                <w:sz w:val="20"/>
+                <w:szCs w:val="20"/>
+              </w:rPr>
+              <w:t xml:space="preserve">Lab 4 · ensayo general + evaluación final oral</w:t>
+            </w:r>
+          </w:p>
+        </w:tc>
+        <w:tc>
+          <w:tcPr>
+            <w:tcW w:type="dxa" w:w="4000"/>
+            <w:shd w:fill="F7F8FA" w:val="clear"/>
+            <w:tcMar>
+              <w:top w:type="dxa" w:w="70"/>
+              <w:left w:type="dxa" w:w="110"/>
+              <w:bottom w:type="dxa" w:w="70"/>
+              <w:right w:type="dxa" w:w="110"/>
+            </w:tcMar>
+            <w:vAlign w:val="center"/>
+          </w:tcPr>
+          <w:p>
+            <w:pPr>
+              <w:spacing w:after="0" w:line="264"/>
+            </w:pPr>
+            <w:r>
+              <w:rPr>
+                <w:rFonts w:ascii="Arial" w:cs="Arial" w:eastAsia="Arial" w:hAnsi="Arial"/>
+                <w:color w:val="1B1C24"/>
+                <w:sz w:val="20"/>
+                <w:szCs w:val="20"/>
+              </w:rPr>
+              <w:t xml:space="preserve">Certificado A2 completo · prep. TOPIK I-2</w:t>
+            </w:r>
+          </w:p>
+        </w:tc>
+      </w:tr>
+    </w:tbl>
+    <w:p>
+      <w:pPr>
+        <w:spacing w:after="120" w:line="288"/>
+      </w:pPr>
+      <w:r>
+        <w:rPr>
+          <w:rFonts w:ascii="Arial" w:cs="Arial" w:eastAsia="Arial" w:hAnsi="Arial"/>
+          <w:b/>
+          <w:bCs/>
+          <w:color w:val="1B1C24"/>
+          <w:sz w:val="21"/>
+          <w:szCs w:val="21"/>
+        </w:rPr>
+        <w:t xml:space="preserve">Calendario de la escalera: </w:t>
+      </w:r>
+      <w:r>
+        <w:rPr>
+          <w:rFonts w:ascii="Arial" w:cs="Arial" w:eastAsia="Arial" w:hAnsi="Arial"/>
+          <w:color w:val="1B1C24"/>
+          <w:sz w:val="21"/>
+          <w:szCs w:val="21"/>
+        </w:rPr>
+        <w:t xml:space="preserve">en octubre corre A2.1 (primera cohorte de Abby, 1 clase/semana). En la cohorte de enero corren A2.1 (grupo nuevo) y A2.2 (los que continúan) en días distintos — desde ahí, las dos partes conviven cada trimestre. Requisitos: A2.1 exige A1 completo o quiz; A2.2 exige A2.1.</w:t>
       </w:r>
     </w:p>
     <w:p>
@@ -3375,7 +4959,7 @@
                 <w:sz w:val="20"/>
                 <w:szCs w:val="20"/>
               </w:rPr>
-              <w:t xml:space="preserve">Conversacional Abby (16 ses.)</w:t>
+              <w:t xml:space="preserve">Conversacional A2.1 / A2.2 (8 ses. c/u)</w:t>
             </w:r>
           </w:p>
         </w:tc>
@@ -3402,7 +4986,7 @@
                 <w:sz w:val="20"/>
                 <w:szCs w:val="20"/>
               </w:rPr>
-              <w:t xml:space="preserve">US$200</w:t>
+              <w:t xml:space="preserve">US$150 c/u</w:t>
             </w:r>
           </w:p>
         </w:tc>
@@ -3429,7 +5013,7 @@
                 <w:sz w:val="20"/>
                 <w:szCs w:val="20"/>
               </w:rPr>
-              <w:t xml:space="preserve">US$12,50</w:t>
+              <w:t xml:space="preserve">US$18,75</w:t>
             </w:r>
           </w:p>
         </w:tc>
@@ -3456,7 +5040,7 @@
                 <w:sz w:val="20"/>
                 <w:szCs w:val="20"/>
               </w:rPr>
-              <w:t xml:space="preserve">Ya era el precio del Plan de Cursos (US$100/mes × 2) — profesora nativa dedicada, cupo 12: barato para lo que es</w:t>
+              <w:t xml:space="preserve">Con la división, el ticket Abby baja de $200 de golpe a $150 por peldaño (o $79/mes) — y el camino completo con nativa (16 ses.) queda en $300 de lista / ~$240 con early-bird y bundle</w:t>
             </w:r>
           </w:p>
         </w:tc>
@@ -3933,7 +5517,7 @@
                 <w:sz w:val="20"/>
                 <w:szCs w:val="20"/>
               </w:rPr>
-              <w:t xml:space="preserve">Conversacional (Abby)</w:t>
+              <w:t xml:space="preserve">Conversacional A2.1 (Abby)</w:t>
             </w:r>
           </w:p>
         </w:tc>
@@ -3959,7 +5543,7 @@
                 <w:sz w:val="20"/>
                 <w:szCs w:val="20"/>
               </w:rPr>
-              <w:t xml:space="preserve">US$200</w:t>
+              <w:t xml:space="preserve">US$150</w:t>
             </w:r>
           </w:p>
         </w:tc>
@@ -3985,7 +5569,7 @@
                 <w:sz w:val="20"/>
                 <w:szCs w:val="20"/>
               </w:rPr>
-              <w:t xml:space="preserve">US$180 pago único · US$160 alumni</w:t>
+              <w:t xml:space="preserve">US$119 alumni</w:t>
             </w:r>
           </w:p>
         </w:tc>
@@ -4011,7 +5595,7 @@
                 <w:sz w:val="20"/>
                 <w:szCs w:val="20"/>
               </w:rPr>
-              <w:t xml:space="preserve">US$100 × 2 meses</w:t>
+              <w:t xml:space="preserve">US$79 × 2 meses</w:t>
             </w:r>
           </w:p>
         </w:tc>
@@ -4040,7 +5624,7 @@
                 <w:sz w:val="20"/>
                 <w:szCs w:val="20"/>
               </w:rPr>
-              <w:t xml:space="preserve">Bundle “Ruta A2” (2 cursos seguidos)</w:t>
+              <w:t xml:space="preserve">Conversacional A2.2 (Abby)</w:t>
             </w:r>
           </w:p>
         </w:tc>
@@ -4067,7 +5651,7 @@
                 <w:sz w:val="20"/>
                 <w:szCs w:val="20"/>
               </w:rPr>
-              <w:t xml:space="preserve">US$299</w:t>
+              <w:t xml:space="preserve">US$150</w:t>
             </w:r>
           </w:p>
         </w:tc>
@@ -4094,6 +5678,113 @@
                 <w:sz w:val="20"/>
                 <w:szCs w:val="20"/>
               </w:rPr>
+              <w:t xml:space="preserve">US$119 quien viene de A2.1</w:t>
+            </w:r>
+          </w:p>
+        </w:tc>
+        <w:tc>
+          <w:tcPr>
+            <w:tcW w:type="dxa" w:w="2260"/>
+            <w:shd w:fill="F7F8FA" w:val="clear"/>
+            <w:tcMar>
+              <w:top w:type="dxa" w:w="70"/>
+              <w:left w:type="dxa" w:w="110"/>
+              <w:bottom w:type="dxa" w:w="70"/>
+              <w:right w:type="dxa" w:w="110"/>
+            </w:tcMar>
+            <w:vAlign w:val="center"/>
+          </w:tcPr>
+          <w:p>
+            <w:pPr>
+              <w:spacing w:after="0" w:line="264"/>
+            </w:pPr>
+            <w:r>
+              <w:rPr>
+                <w:rFonts w:ascii="Arial" w:cs="Arial" w:eastAsia="Arial" w:hAnsi="Arial"/>
+                <w:color w:val="1B1C24"/>
+                <w:sz w:val="20"/>
+                <w:szCs w:val="20"/>
+              </w:rPr>
+              <w:t xml:space="preserve">US$79 × 2 meses</w:t>
+            </w:r>
+          </w:p>
+        </w:tc>
+      </w:tr>
+      <w:tr>
+        <w:tc>
+          <w:tcPr>
+            <w:tcW w:type="dxa" w:w="2700"/>
+            <w:tcMar>
+              <w:top w:type="dxa" w:w="70"/>
+              <w:left w:type="dxa" w:w="110"/>
+              <w:bottom w:type="dxa" w:w="70"/>
+              <w:right w:type="dxa" w:w="110"/>
+            </w:tcMar>
+            <w:vAlign w:val="center"/>
+          </w:tcPr>
+          <w:p>
+            <w:pPr>
+              <w:spacing w:after="0" w:line="264"/>
+            </w:pPr>
+            <w:r>
+              <w:rPr>
+                <w:rFonts w:ascii="Arial" w:cs="Arial" w:eastAsia="Arial" w:hAnsi="Arial"/>
+                <w:color w:val="1B1C24"/>
+                <w:sz w:val="20"/>
+                <w:szCs w:val="20"/>
+              </w:rPr>
+              <w:t xml:space="preserve">Bundle “dos peldaños seguidos” (cualquier par)</w:t>
+            </w:r>
+          </w:p>
+        </w:tc>
+        <w:tc>
+          <w:tcPr>
+            <w:tcW w:type="dxa" w:w="1500"/>
+            <w:tcMar>
+              <w:top w:type="dxa" w:w="70"/>
+              <w:left w:type="dxa" w:w="110"/>
+              <w:bottom w:type="dxa" w:w="70"/>
+              <w:right w:type="dxa" w:w="110"/>
+            </w:tcMar>
+            <w:vAlign w:val="center"/>
+          </w:tcPr>
+          <w:p>
+            <w:pPr>
+              <w:spacing w:after="0" w:line="264"/>
+            </w:pPr>
+            <w:r>
+              <w:rPr>
+                <w:rFonts w:ascii="Arial" w:cs="Arial" w:eastAsia="Arial" w:hAnsi="Arial"/>
+                <w:color w:val="1B1C24"/>
+                <w:sz w:val="20"/>
+                <w:szCs w:val="20"/>
+              </w:rPr>
+              <w:t xml:space="preserve">US$269</w:t>
+            </w:r>
+          </w:p>
+        </w:tc>
+        <w:tc>
+          <w:tcPr>
+            <w:tcW w:type="dxa" w:w="2900"/>
+            <w:tcMar>
+              <w:top w:type="dxa" w:w="70"/>
+              <w:left w:type="dxa" w:w="110"/>
+              <w:bottom w:type="dxa" w:w="70"/>
+              <w:right w:type="dxa" w:w="110"/>
+            </w:tcMar>
+            <w:vAlign w:val="center"/>
+          </w:tcPr>
+          <w:p>
+            <w:pPr>
+              <w:spacing w:after="0" w:line="264"/>
+            </w:pPr>
+            <w:r>
+              <w:rPr>
+                <w:rFonts w:ascii="Arial" w:cs="Arial" w:eastAsia="Arial" w:hAnsi="Arial"/>
+                <w:color w:val="1B1C24"/>
+                <w:sz w:val="20"/>
+                <w:szCs w:val="20"/>
+              </w:rPr>
               <w:t xml:space="preserve">— (ya es la oferta)</w:t>
             </w:r>
           </w:p>
@@ -4101,7 +5792,6 @@
         <w:tc>
           <w:tcPr>
             <w:tcW w:type="dxa" w:w="2260"/>
-            <w:shd w:fill="F7F8FA" w:val="clear"/>
             <w:tcMar>
               <w:top w:type="dxa" w:w="70"/>
               <w:left w:type="dxa" w:w="110"/>
@@ -4129,12 +5819,7 @@
     </w:tbl>
     <w:p>
       <w:pPr>
-        <w:pStyle w:val="ListParagraph"/>
-        <w:numPr>
-          <w:ilvl w:val="0"/>
-          <w:numId w:val="2"/>
-        </w:numPr>
-        <w:spacing w:after="80" w:line="288"/>
+        <w:spacing w:after="120" w:line="288"/>
       </w:pPr>
       <w:r>
         <w:rPr>
@@ -4145,7 +5830,7 @@
           <w:sz w:val="21"/>
           <w:szCs w:val="21"/>
         </w:rPr>
-        <w:t xml:space="preserve">Condición 1 — ancla mensual: </w:t>
+        <w:t xml:space="preserve">La elegancia del precio único: </w:t>
       </w:r>
       <w:r>
         <w:rPr>
@@ -4154,7 +5839,7 @@
           <w:sz w:val="21"/>
           <w:szCs w:val="21"/>
         </w:rPr>
-        <w:t xml:space="preserve">comunica “desde US$79/mes” en redes y landing; el $150 aparece como “pago único (ahorra $8)”. $79/mes se siente accesible; $150 de golpe se siente salto.</w:t>
+        <w:t xml:space="preserve">“cada peldaño de la escalera: US$150 (o $79/mes) — siempre”. Un solo número que aprender, cero fricción al subir de nivel, y el early-bird $119 como palanca de cada cierre de cohorte.</w:t>
       </w:r>
     </w:p>
     <w:p>
@@ -4175,7 +5860,7 @@
           <w:sz w:val="21"/>
           <w:szCs w:val="21"/>
         </w:rPr>
-        <w:t xml:space="preserve">Condición 2 — puente para la lista: </w:t>
+        <w:t xml:space="preserve">Condición 1 — ancla mensual: </w:t>
       </w:r>
       <w:r>
         <w:rPr>
@@ -4184,102 +5869,7 @@
           <w:sz w:val="21"/>
           <w:szCs w:val="21"/>
         </w:rPr>
-        <w:t xml:space="preserve">los que venían del mundo-$89 reciben el early-bird de US$119 con fecha límite (2 oct). Nadie siente el alza como castigo, y el $150 queda instalado como precio normal desde el día uno para el público nuevo.</w:t>
-      </w:r>
-    </w:p>
-    <w:p>
-      <w:pPr>
-        <w:spacing w:after="120" w:line="288"/>
-      </w:pPr>
-      <w:r>
-        <w:rPr>
-          <w:rFonts w:ascii="Arial" w:cs="Arial" w:eastAsia="Arial" w:hAnsi="Arial"/>
-          <w:b/>
-          <w:bCs/>
-          <w:color w:val="1B1C24"/>
-          <w:sz w:val="21"/>
-          <w:szCs w:val="21"/>
-        </w:rPr>
-        <w:t xml:space="preserve">Ingresos por cohorte (escenario esperado, 75% de cupo, mix early-bird): </w:t>
-      </w:r>
-      <w:r>
-        <w:rPr>
-          <w:rFonts w:ascii="Arial" w:cs="Arial" w:eastAsia="Arial" w:hAnsi="Arial"/>
-          <w:color w:val="1B1C24"/>
-          <w:sz w:val="21"/>
-          <w:szCs w:val="21"/>
-        </w:rPr>
-        <w:t xml:space="preserve">Básico 1.1 ~11×$130 ≈ $1.430 · Básico 2 ~11×$135 ≈ $1.485 · Conversacional ~9×$190 ≈ $1.710 → </w:t>
-      </w:r>
-      <w:r>
-        <w:rPr>
-          <w:rFonts w:ascii="Arial" w:cs="Arial" w:eastAsia="Arial" w:hAnsi="Arial"/>
-          <w:b/>
-          <w:bCs/>
-          <w:color w:val="1B1C24"/>
-          <w:sz w:val="21"/>
-          <w:szCs w:val="21"/>
-        </w:rPr>
-        <w:t xml:space="preserve">≈ US$4.600 por cohorte</w:t>
-      </w:r>
-      <w:r>
-        <w:rPr>
-          <w:rFonts w:ascii="Arial" w:cs="Arial" w:eastAsia="Arial" w:hAnsi="Arial"/>
-          <w:color w:val="1B1C24"/>
-          <w:sz w:val="21"/>
-          <w:szCs w:val="21"/>
-        </w:rPr>
-        <w:t xml:space="preserve"> (vs ~US$3.300 del plan anterior: +40% sin tocar cupos). Cuatro cohortes al año ≈ US$18.400 con solo estos tres productos.</w:t>
-      </w:r>
-    </w:p>
-    <w:p>
-      <w:pPr>
-        <w:spacing w:after="120" w:line="288"/>
-      </w:pPr>
-      <w:r>
-        <w:rPr>
-          <w:rFonts w:ascii="Arial" w:cs="Arial" w:eastAsia="Arial" w:hAnsi="Arial"/>
-          <w:i/>
-          <w:iCs/>
-          <w:color w:val="5C5F6B"/>
-          <w:sz w:val="21"/>
-          <w:szCs w:val="21"/>
-        </w:rPr>
-        <w:t xml:space="preserve">Sobre Abby: con $200 de lista y el modelo 60/40, su escenario esperado sube a ~$1.026 por cohorte — el precio también mejora la negociación con ella.</w:t>
-      </w:r>
-    </w:p>
-    <w:p>
-      <w:pPr>
-        <w:keepNext/>
-        <w:pBdr>
-          <w:bottom w:val="single" w:color="CCCCCC" w:sz="6" w:space="4"/>
-        </w:pBdr>
-        <w:spacing w:after="160" w:before="360" w:line="276"/>
-      </w:pPr>
-      <w:r>
-        <w:rPr>
-          <w:rFonts w:ascii="Arial" w:cs="Arial" w:eastAsia="Arial" w:hAnsi="Arial"/>
-          <w:b/>
-          <w:bCs/>
-          <w:color w:val="1B1C24"/>
-          <w:sz w:val="26"/>
-          <w:szCs w:val="26"/>
-        </w:rPr>
-        <w:t xml:space="preserve">6. Al confirmar: la cascada de cambios</w:t>
-      </w:r>
-    </w:p>
-    <w:p>
-      <w:pPr>
-        <w:spacing w:after="120" w:line="288"/>
-      </w:pPr>
-      <w:r>
-        <w:rPr>
-          <w:rFonts w:ascii="Arial" w:cs="Arial" w:eastAsia="Arial" w:hAnsi="Arial"/>
-          <w:color w:val="1B1C24"/>
-          <w:sz w:val="21"/>
-          <w:szCs w:val="21"/>
-        </w:rPr>
-        <w:t xml:space="preserve">Cuando me digas “precios confirmados”, ejecuto en un solo paso:</w:t>
+        <w:t xml:space="preserve">comunica “desde US$79/mes” en redes y landing; el $150 aparece como “pago único (ahorra $8)”. $79/mes se siente accesible; $150 de golpe se siente salto.</w:t>
       </w:r>
     </w:p>
     <w:p>
@@ -4294,11 +5884,156 @@
       <w:r>
         <w:rPr>
           <w:rFonts w:ascii="Arial" w:cs="Arial" w:eastAsia="Arial" w:hAnsi="Arial"/>
+          <w:b/>
+          <w:bCs/>
           <w:color w:val="1B1C24"/>
           <w:sz w:val="21"/>
           <w:szCs w:val="21"/>
         </w:rPr>
-        <w:t xml:space="preserve">Programa_Cursos_Octubre_2026 (docx/pdf): Básico 1.1 a 8 sesiones con este temario, precios nuevos, fechas re-sincronizadas (todos terminan la semana del 24–28 nov).</w:t>
+        <w:t xml:space="preserve">Condición 2 — puente para la lista: </w:t>
+      </w:r>
+      <w:r>
+        <w:rPr>
+          <w:rFonts w:ascii="Arial" w:cs="Arial" w:eastAsia="Arial" w:hAnsi="Arial"/>
+          <w:color w:val="1B1C24"/>
+          <w:sz w:val="21"/>
+          <w:szCs w:val="21"/>
+        </w:rPr>
+        <w:t xml:space="preserve">los que venían del mundo-$89 reciben el early-bird de US$119 con fecha límite (2 oct). Nadie siente el alza como castigo, y el $150 queda instalado como precio normal desde el día uno para el público nuevo.</w:t>
+      </w:r>
+    </w:p>
+    <w:p>
+      <w:pPr>
+        <w:spacing w:after="120" w:line="288"/>
+      </w:pPr>
+      <w:r>
+        <w:rPr>
+          <w:rFonts w:ascii="Arial" w:cs="Arial" w:eastAsia="Arial" w:hAnsi="Arial"/>
+          <w:b/>
+          <w:bCs/>
+          <w:color w:val="1B1C24"/>
+          <w:sz w:val="21"/>
+          <w:szCs w:val="21"/>
+        </w:rPr>
+        <w:t xml:space="preserve">Ingresos (escenario esperado, 75% de cupo, mix early-bird ~$135 promedio): </w:t>
+      </w:r>
+      <w:r>
+        <w:rPr>
+          <w:rFonts w:ascii="Arial" w:cs="Arial" w:eastAsia="Arial" w:hAnsi="Arial"/>
+          <w:color w:val="1B1C24"/>
+          <w:sz w:val="21"/>
+          <w:szCs w:val="21"/>
+        </w:rPr>
+        <w:t xml:space="preserve">Octubre (1.1 + 2 + A2.1): ~3 × 10 × $135 ≈ </w:t>
+      </w:r>
+      <w:r>
+        <w:rPr>
+          <w:rFonts w:ascii="Arial" w:cs="Arial" w:eastAsia="Arial" w:hAnsi="Arial"/>
+          <w:b/>
+          <w:bCs/>
+          <w:color w:val="1B1C24"/>
+          <w:sz w:val="21"/>
+          <w:szCs w:val="21"/>
+        </w:rPr>
+        <w:t xml:space="preserve">US$4.050</w:t>
+      </w:r>
+      <w:r>
+        <w:rPr>
+          <w:rFonts w:ascii="Arial" w:cs="Arial" w:eastAsia="Arial" w:hAnsi="Arial"/>
+          <w:color w:val="1B1C24"/>
+          <w:sz w:val="21"/>
+          <w:szCs w:val="21"/>
+        </w:rPr>
+        <w:t xml:space="preserve">. Desde enero, con A2.2 sumado: ~4 cursos × 10 × $135 ≈ </w:t>
+      </w:r>
+      <w:r>
+        <w:rPr>
+          <w:rFonts w:ascii="Arial" w:cs="Arial" w:eastAsia="Arial" w:hAnsi="Arial"/>
+          <w:b/>
+          <w:bCs/>
+          <w:color w:val="1B1C24"/>
+          <w:sz w:val="21"/>
+          <w:szCs w:val="21"/>
+        </w:rPr>
+        <w:t xml:space="preserve">US$5.400 por cohorte</w:t>
+      </w:r>
+      <w:r>
+        <w:rPr>
+          <w:rFonts w:ascii="Arial" w:cs="Arial" w:eastAsia="Arial" w:hAnsi="Arial"/>
+          <w:color w:val="1B1C24"/>
+          <w:sz w:val="21"/>
+          <w:szCs w:val="21"/>
+        </w:rPr>
+        <w:t xml:space="preserve"> → ~US$20.000/año con la escalera base (vs ~US$13.000 del plan anterior).</w:t>
+      </w:r>
+    </w:p>
+    <w:p>
+      <w:pPr>
+        <w:spacing w:after="120" w:line="288"/>
+      </w:pPr>
+      <w:r>
+        <w:rPr>
+          <w:rFonts w:ascii="Arial" w:cs="Arial" w:eastAsia="Arial" w:hAnsi="Arial"/>
+          <w:i/>
+          <w:iCs/>
+          <w:color w:val="5C5F6B"/>
+          <w:sz w:val="21"/>
+          <w:szCs w:val="21"/>
+        </w:rPr>
+        <w:t xml:space="preserve">Sobre Abby: con el 60/40, cada parte le deja ~$810 esperado por 8 sesiones (~$100/sesión) — mejor por hora que el diseño de 16 sesiones, con la mitad del compromiso semanal. Argumento fuerte para la negociación.</w:t>
+      </w:r>
+    </w:p>
+    <w:p>
+      <w:pPr>
+        <w:keepNext/>
+        <w:pBdr>
+          <w:bottom w:val="single" w:color="CCCCCC" w:sz="6" w:space="4"/>
+        </w:pBdr>
+        <w:spacing w:after="160" w:before="360" w:line="276"/>
+      </w:pPr>
+      <w:r>
+        <w:rPr>
+          <w:rFonts w:ascii="Arial" w:cs="Arial" w:eastAsia="Arial" w:hAnsi="Arial"/>
+          <w:b/>
+          <w:bCs/>
+          <w:color w:val="1B1C24"/>
+          <w:sz w:val="26"/>
+          <w:szCs w:val="26"/>
+        </w:rPr>
+        <w:t xml:space="preserve">6. Al confirmar: la cascada de cambios</w:t>
+      </w:r>
+    </w:p>
+    <w:p>
+      <w:pPr>
+        <w:spacing w:after="120" w:line="288"/>
+      </w:pPr>
+      <w:r>
+        <w:rPr>
+          <w:rFonts w:ascii="Arial" w:cs="Arial" w:eastAsia="Arial" w:hAnsi="Arial"/>
+          <w:color w:val="1B1C24"/>
+          <w:sz w:val="21"/>
+          <w:szCs w:val="21"/>
+        </w:rPr>
+        <w:t xml:space="preserve">Cuando me digas “precios confirmados”, ejecuto en un solo paso:</w:t>
+      </w:r>
+    </w:p>
+    <w:p>
+      <w:pPr>
+        <w:pStyle w:val="ListParagraph"/>
+        <w:numPr>
+          <w:ilvl w:val="0"/>
+          <w:numId w:val="2"/>
+        </w:numPr>
+        <w:spacing w:after="80" w:line="288"/>
+      </w:pPr>
+      <w:r>
+        <w:rPr>
+          <w:rFonts w:ascii="Arial" w:cs="Arial" w:eastAsia="Arial" w:hAnsi="Arial"/>
+          <w:color w:val="1B1C24"/>
+          <w:sz w:val="21"/>
+          <w:szCs w:val="21"/>
+        </w:rPr>
+        <w:t xml:space="preserve">Programa_Cursos_Octubre_2026 (docx/pdf): Básico 1.1 a 8 sesiones con este temario, Conversacional dividido en A2.1/A2.2 (octubre abre A2.1), precios nuevos, fechas re-sincronizadas (todos terminan la semana del 24–28 nov). La Guía CEFR–TOPIK se actualiza con la escalera de 4 peldaños básicos.</w:t>
       </w:r>
     </w:p>
     <w:p>

</xml_diff>

<commit_message>
Cambia el acento de texto de rojo a azul en los tres documentos
En la cultura coreana el texto rojo se asocia con la muerte y es
falta de respeto; todos los titulos y acentos de texto pasan al azul
corporativo #4236F6 en Programa de Cursos, Guia CEFR-TOPIK y
Desarrollo de Clases.

Co-Authored-By: Claude Fable 5 <noreply@anthropic.com>
</commit_message>
<xml_diff>
--- a/Desarrollo_Clases_2026-2.docx
+++ b/Desarrollo_Clases_2026-2.docx
@@ -46,7 +46,7 @@
           <w:rFonts w:ascii="Arial" w:cs="Arial" w:eastAsia="Arial" w:hAnsi="Arial"/>
           <w:b/>
           <w:bCs/>
-          <w:color w:val="C8001E"/>
+          <w:color w:val="4236F6"/>
           <w:sz w:val="24"/>
           <w:szCs w:val="24"/>
         </w:rPr>
@@ -56,7 +56,7 @@
     <w:p>
       <w:pPr>
         <w:pBdr>
-          <w:bottom w:val="single" w:color="C8001E" w:sz="12" w:space="1"/>
+          <w:bottom w:val="single" w:color="4236F6" w:sz="12" w:space="1"/>
         </w:pBdr>
         <w:spacing w:after="260"/>
         <w:jc w:val="center"/>
@@ -3052,7 +3052,7 @@
           <w:rFonts w:ascii="Arial" w:cs="Arial" w:eastAsia="Arial" w:hAnsi="Arial"/>
           <w:b/>
           <w:bCs/>
-          <w:color w:val="C8001E"/>
+          <w:color w:val="4236F6"/>
           <w:sz w:val="22"/>
           <w:szCs w:val="22"/>
         </w:rPr>
@@ -3831,7 +3831,7 @@
           <w:rFonts w:ascii="Arial" w:cs="Arial" w:eastAsia="Arial" w:hAnsi="Arial"/>
           <w:b/>
           <w:bCs/>
-          <w:color w:val="C8001E"/>
+          <w:color w:val="4236F6"/>
           <w:sz w:val="22"/>
           <w:szCs w:val="22"/>
         </w:rPr>
@@ -4666,7 +4666,7 @@
           <w:rFonts w:ascii="Arial" w:cs="Arial" w:eastAsia="Arial" w:hAnsi="Arial"/>
           <w:b/>
           <w:bCs/>
-          <w:color w:val="C8001E"/>
+          <w:color w:val="4236F6"/>
           <w:sz w:val="21"/>
           <w:szCs w:val="21"/>
         </w:rPr>
@@ -4683,7 +4683,7 @@
           <w:rFonts w:ascii="Arial" w:cs="Arial" w:eastAsia="Arial" w:hAnsi="Arial"/>
           <w:b/>
           <w:bCs/>
-          <w:color w:val="C8001E"/>
+          <w:color w:val="4236F6"/>
           <w:sz w:val="22"/>
           <w:szCs w:val="22"/>
         </w:rPr>
@@ -5132,7 +5132,7 @@
           <w:rFonts w:ascii="Arial" w:cs="Arial" w:eastAsia="Arial" w:hAnsi="Arial"/>
           <w:b/>
           <w:bCs/>
-          <w:color w:val="C8001E"/>
+          <w:color w:val="4236F6"/>
           <w:sz w:val="22"/>
           <w:szCs w:val="22"/>
         </w:rPr>
@@ -6141,7 +6141,7 @@
           <w:bCs/>
           <w:i/>
           <w:iCs/>
-          <w:color w:val="C8001E"/>
+          <w:color w:val="4236F6"/>
           <w:sz w:val="21"/>
           <w:szCs w:val="21"/>
         </w:rPr>

</xml_diff>